<commit_message>
Add case study PDF files and update docx documents
</commit_message>
<xml_diff>
--- a/case study 2.docx
+++ b/case study 2.docx
@@ -329,8 +329,58 @@
           <w:bCs/>
           <w:lang w:val="en-IN"/>
         </w:rPr>
-        <w:t>To ensure accuracy, the outputs generated by the Fenwick Tree were compared with manually calculated totals, and the results matched successfully. The implementation demonstrated how the Fenwick Tree significantly improves performance by reducing both update and query operations from O(n) in a traditional array-based approach to O(log n). This efficiency makes Fenwick Trees highly suitable for real-time financial systems, banking applications, expense tracking platforms, and data analytics environments where frequent updates and rapid retrieval of cumulative financial information are required. The case study highlights the practical advantages of using advanced data structures to handle large volumes of transactional data efficiently and accurately.</w:t>
+        <w:t xml:space="preserve">To ensure accuracy, the outputs generated by the Fenwick Tree were compared with manually calculated totals, and the results matched successfully. The implementation demonstrated how the Fenwick Tree significantly improves performance by reducing both update and query operations from O(n) in a traditional array-based approach to </w:t>
       </w:r>
+      <w:proofErr w:type="gramStart"/>
+      <w:r>
+        <w:rPr>
+          <w:b/>
+          <w:bCs/>
+          <w:lang w:val="en-IN"/>
+        </w:rPr>
+        <w:t>O(</w:t>
+      </w:r>
+      <w:proofErr w:type="gramEnd"/>
+      <w:r>
+        <w:rPr>
+          <w:b/>
+          <w:bCs/>
+          <w:lang w:val="en-IN"/>
+        </w:rPr>
+        <w:t>log n). This efficiency makes Fenwick Trees highly suitable for real-time financial systems, banking applications, expense tracking platforms, and data analytics environments where frequent updates and rapid retrieval of cumulative financial information are required. The case study highlights the practical advantages of using advanced data structures to handle large volumes of transactional data efficiently and accurately.</w:t>
+      </w:r>
+    </w:p>
+    <w:p>
+      <w:pPr>
+        <w:rPr>
+          <w:b/>
+          <w:bCs/>
+        </w:rPr>
+      </w:pPr>
+    </w:p>
+    <w:p>
+      <w:pPr>
+        <w:rPr>
+          <w:b/>
+          <w:bCs/>
+        </w:rPr>
+      </w:pPr>
+    </w:p>
+    <w:p>
+      <w:pPr>
+        <w:rPr>
+          <w:b/>
+          <w:bCs/>
+        </w:rPr>
+      </w:pPr>
+    </w:p>
+    <w:p>
+      <w:pPr>
+        <w:rPr>
+          <w:b/>
+          <w:bCs/>
+        </w:rPr>
+      </w:pPr>
     </w:p>
     <w:p>
       <w:pPr>
@@ -389,7 +439,6 @@
         <w:spacing w:after="0"/>
       </w:pPr>
       <w:r>
-        <w:lastRenderedPageBreak/>
         <w:t>Executed range query from day 5 to day 12.</w:t>
       </w:r>
     </w:p>
@@ -412,11 +461,6 @@
         <w:spacing w:after="0"/>
       </w:pPr>
     </w:p>
-    <w:p/>
-    <w:p/>
-    <w:p/>
-    <w:p/>
-    <w:p/>
     <w:p/>
     <w:p>
       <w:r>
@@ -470,15 +514,39 @@
         <w:spacing w:after="0"/>
       </w:pPr>
       <w:r>
-        <w:t>Prefix Sum(12) = 12050</w:t>
+        <w:t xml:space="preserve">Prefix </w:t>
+      </w:r>
+      <w:proofErr w:type="gramStart"/>
+      <w:r>
+        <w:t>Sum(</w:t>
+      </w:r>
+      <w:proofErr w:type="gramEnd"/>
+      <w:r>
+        <w:t>12) = 12050</w:t>
       </w:r>
       <w:r>
         <w:br/>
-        <w:t>Prefix Sum(4) = 4400</w:t>
+        <w:t xml:space="preserve">Prefix </w:t>
+      </w:r>
+      <w:proofErr w:type="gramStart"/>
+      <w:r>
+        <w:t>Sum(</w:t>
+      </w:r>
+      <w:proofErr w:type="gramEnd"/>
+      <w:r>
+        <w:t>4) = 4400</w:t>
       </w:r>
       <w:r>
         <w:br/>
-        <w:t>Range Sum(5,12) = ₹7650</w:t>
+        <w:t xml:space="preserve">Range </w:t>
+      </w:r>
+      <w:proofErr w:type="gramStart"/>
+      <w:r>
+        <w:t>Sum(</w:t>
+      </w:r>
+      <w:proofErr w:type="gramEnd"/>
+      <w:r>
+        <w:t>5,12) = ₹7650</w:t>
       </w:r>
     </w:p>
     <w:p>
@@ -486,7 +554,23 @@
         <w:spacing w:after="0"/>
       </w:pPr>
       <w:r>
-        <w:t>Update Operation : O(log n)</w:t>
+        <w:t xml:space="preserve">Update </w:t>
+      </w:r>
+      <w:proofErr w:type="gramStart"/>
+      <w:r>
+        <w:t>Operation :</w:t>
+      </w:r>
+      <w:proofErr w:type="gramEnd"/>
+      <w:r>
+        <w:t xml:space="preserve"> </w:t>
+      </w:r>
+      <w:proofErr w:type="gramStart"/>
+      <w:r>
+        <w:t>O(</w:t>
+      </w:r>
+      <w:proofErr w:type="gramEnd"/>
+      <w:r>
+        <w:t>log n)</w:t>
       </w:r>
     </w:p>
     <w:p>
@@ -494,7 +578,23 @@
         <w:spacing w:after="0"/>
       </w:pPr>
       <w:r>
-        <w:t>Prefix Sum Query : O(log n)</w:t>
+        <w:t xml:space="preserve">Prefix Sum </w:t>
+      </w:r>
+      <w:proofErr w:type="gramStart"/>
+      <w:r>
+        <w:t>Query :</w:t>
+      </w:r>
+      <w:proofErr w:type="gramEnd"/>
+      <w:r>
+        <w:t xml:space="preserve"> </w:t>
+      </w:r>
+      <w:proofErr w:type="gramStart"/>
+      <w:r>
+        <w:t>O(</w:t>
+      </w:r>
+      <w:proofErr w:type="gramEnd"/>
+      <w:r>
+        <w:t>log n)</w:t>
       </w:r>
     </w:p>
     <w:p>
@@ -502,7 +602,23 @@
         <w:spacing w:after="0"/>
       </w:pPr>
       <w:r>
-        <w:t>Range Sum Query  : O(log n)</w:t>
+        <w:t xml:space="preserve">Range Sum </w:t>
+      </w:r>
+      <w:proofErr w:type="gramStart"/>
+      <w:r>
+        <w:t>Query  :</w:t>
+      </w:r>
+      <w:proofErr w:type="gramEnd"/>
+      <w:r>
+        <w:t xml:space="preserve"> </w:t>
+      </w:r>
+      <w:proofErr w:type="gramStart"/>
+      <w:r>
+        <w:t>O(</w:t>
+      </w:r>
+      <w:proofErr w:type="gramEnd"/>
+      <w:r>
+        <w:t>log n)</w:t>
       </w:r>
     </w:p>
     <w:p>
@@ -510,7 +626,15 @@
         <w:spacing w:after="0"/>
       </w:pPr>
       <w:r>
-        <w:t>Space Complexity : O(n)</w:t>
+        <w:t xml:space="preserve">Space </w:t>
+      </w:r>
+      <w:proofErr w:type="gramStart"/>
+      <w:r>
+        <w:t>Complexity :</w:t>
+      </w:r>
+      <w:proofErr w:type="gramEnd"/>
+      <w:r>
+        <w:t xml:space="preserve"> O(n)</w:t>
       </w:r>
     </w:p>
     <w:p>
@@ -531,7 +655,23 @@
           <w:b/>
           <w:bCs/>
         </w:rPr>
-        <w:t xml:space="preserve">GITHUB LINK : </w:t>
+        <w:t xml:space="preserve">GITHUB </w:t>
+      </w:r>
+      <w:proofErr w:type="gramStart"/>
+      <w:r>
+        <w:rPr>
+          <w:b/>
+          <w:bCs/>
+        </w:rPr>
+        <w:t>LINK :</w:t>
+      </w:r>
+      <w:proofErr w:type="gramEnd"/>
+      <w:r>
+        <w:rPr>
+          <w:b/>
+          <w:bCs/>
+        </w:rPr>
+        <w:t xml:space="preserve"> </w:t>
       </w:r>
       <w:r>
         <w:rPr>

</xml_diff>